<commit_message>
feat: affiliate, notifications, 2FA, SIMPKB check, ranking percentile and platform enhancements
</commit_message>
<xml_diff>
--- a/apps/web/public/templates/template-bank-soal-tka.docx
+++ b/apps/web/public/templates/template-bank-soal-tka.docx
@@ -15,7 +15,7 @@
         <w:pStyle w:val="Normal"/>
       </w:pPr>
       <w:r>
-        <w:t xml:space="preserve">Format terbaru: Pilihan Ganda Sederhana, PGK MCMA, dan PGK Kategori - satu soal per nomor</w:t>
+        <w:t xml:space="preserve">Format terbaru: PG Sederhana, PGK MCMA, PGK Kategori, dan Esai - satu soal per nomor</w:t>
       </w:r>
     </w:p>
     <w:p>
@@ -39,7 +39,7 @@
         <w:pStyle w:val="Normal"/>
       </w:pPr>
       <w:r>
-        <w:t xml:space="preserve">2. Bentuk soal: PG Sederhana (tepat satu benar), PGK MCMA (minimal dua benar), atau PGK Kategori (setiap pernyataan wajib diberi kategori).</w:t>
+        <w:t xml:space="preserve">2. Bentuk soal: PG Sederhana (tepat satu benar), PGK MCMA (minimal dua benar), PGK Kategori (setiap pernyataan wajib diberi kategori), atau Esai (jawaban uraian, kunci berisi jawaban referensi).</w:t>
       </w:r>
     </w:p>
     <w:p>
@@ -55,7 +55,7 @@
         <w:pStyle w:val="Normal"/>
       </w:pPr>
       <w:r>
-        <w:t xml:space="preserve">4. Sintaks kunci: Sederhana = B | MCMA = A,C | Kategori = A=Benar;B=Salah;C=Benar</w:t>
+        <w:t xml:space="preserve">4. Sintaks kunci: Sederhana = B | MCMA = A,C | Kategori = A=Benar;B=Salah;C=Benar | Esai = isi jawaban referensi di Kunci</w:t>
       </w:r>
     </w:p>
     <w:p>
@@ -79,7 +79,7 @@
         <w:pStyle w:val="Normal"/>
       </w:pPr>
       <w:r>
-        <w:t xml:space="preserve">Bentuk: [PG Sederhana / PGK MCMA / PGK Kategori]</w:t>
+        <w:t xml:space="preserve">Bentuk: [PG Sederhana / PGK MCMA / PGK Kategori / Esai]</w:t>
       </w:r>
     </w:p>
     <w:p>
@@ -143,7 +143,7 @@
         <w:pStyle w:val="Normal"/>
       </w:pPr>
       <w:r>
-        <w:t xml:space="preserve">Kunci: [B / A,C / A=Benar;B=Salah;C=Benar]</w:t>
+        <w:t xml:space="preserve">Kunci: [B / A,C / A=Benar;B=Salah;C=Benar / jawaban referensi (esai)]</w:t>
       </w:r>
     </w:p>
     <w:p>

</xml_diff>